<commit_message>
refactor: make pdf kress-proof
</commit_message>
<xml_diff>
--- a/e28_specs.docx
+++ b/e28_specs.docx
@@ -80,21 +80,7 @@
           <w:rFonts w:ascii="Bierstadt" w:hAnsi="Bierstadt"/>
           <w:color w:val="000000" w:themeColor="text1"/>
         </w:rPr>
-        <w:t xml:space="preserve">Produktionszeitrum: 1981 </w:t>
-      </w:r>
-      <w:r>
-        <w:rPr>
-          <w:rFonts w:ascii="Bierstadt" w:hAnsi="Bierstadt"/>
-          <w:color w:val="000000" w:themeColor="text1"/>
-        </w:rPr>
-        <w:t>–</w:t>
-      </w:r>
-      <w:r>
-        <w:rPr>
-          <w:rFonts w:ascii="Bierstadt" w:hAnsi="Bierstadt"/>
-          <w:color w:val="000000" w:themeColor="text1"/>
-        </w:rPr>
-        <w:t xml:space="preserve"> 1989</w:t>
+        <w:t>Produktionszeitrum: 1981 – 1989</w:t>
       </w:r>
     </w:p>
     <w:p>
@@ -134,21 +120,7 @@
           <w:rFonts w:ascii="Bierstadt" w:hAnsi="Bierstadt"/>
           <w:color w:val="000000" w:themeColor="text1"/>
         </w:rPr>
-        <w:t xml:space="preserve">Listenpreis: 25.000 </w:t>
-      </w:r>
-      <w:r>
-        <w:rPr>
-          <w:rFonts w:ascii="Bierstadt" w:hAnsi="Bierstadt"/>
-          <w:color w:val="000000" w:themeColor="text1"/>
-        </w:rPr>
-        <w:t>–</w:t>
-      </w:r>
-      <w:r>
-        <w:rPr>
-          <w:rFonts w:ascii="Bierstadt" w:hAnsi="Bierstadt"/>
-          <w:color w:val="000000" w:themeColor="text1"/>
-        </w:rPr>
-        <w:t xml:space="preserve"> 47.00 DM</w:t>
+        <w:t>Listenpreis: 25.000 – 47.00 DM</w:t>
       </w:r>
     </w:p>
     <w:p>
@@ -342,78 +314,34 @@
           <w:rFonts w:ascii="Bierstadt" w:hAnsi="Bierstadt"/>
           <w:color w:val="000000" w:themeColor="text1"/>
         </w:rPr>
-        <w:t xml:space="preserve">0 </w:t>
-      </w:r>
-      <w:r>
-        <w:rPr>
-          <w:rFonts w:ascii="Bierstadt" w:hAnsi="Bierstadt"/>
-          <w:color w:val="000000" w:themeColor="text1"/>
-        </w:rPr>
+        <w:t>0 – 100 in 6,3 Sekunden</w:t>
+      </w:r>
+    </w:p>
+    <w:p>
+      <w:pPr>
+        <w:pStyle w:val="berschrift2"/>
+        <w:rPr>
+          <w:rFonts w:ascii="Bierstadt" w:hAnsi="Bierstadt"/>
+          <w:color w:val="000000" w:themeColor="text1"/>
+        </w:rPr>
+      </w:pPr>
+      <w:r>
+        <w:rPr>
+          <w:rFonts w:ascii="Bierstadt" w:hAnsi="Bierstadt"/>
+          <w:color w:val="000000" w:themeColor="text1"/>
+        </w:rPr>
+        <w:t>Impressionen</w:t>
+      </w:r>
+    </w:p>
+    <w:p>
+      <w:r>
+        <w:t xml:space="preserve">Die E28 5er-Reihe war nicht einfach ein Wettbewerber </w:t>
+      </w:r>
+      <w:r>
         <w:t>–</w:t>
       </w:r>
       <w:r>
-        <w:rPr>
-          <w:rFonts w:ascii="Bierstadt" w:hAnsi="Bierstadt"/>
-          <w:color w:val="000000" w:themeColor="text1"/>
-        </w:rPr>
-        <w:t xml:space="preserve"> 100 in 6,3 Sekunden</w:t>
-      </w:r>
-    </w:p>
-    <w:p>
-      <w:pPr>
-        <w:pStyle w:val="berschrift2"/>
-        <w:rPr>
-          <w:rFonts w:ascii="Bierstadt" w:hAnsi="Bierstadt"/>
-          <w:color w:val="000000" w:themeColor="text1"/>
-        </w:rPr>
-      </w:pPr>
-      <w:r>
-        <w:rPr>
-          <w:rFonts w:ascii="Bierstadt" w:hAnsi="Bierstadt"/>
-          <w:color w:val="000000" w:themeColor="text1"/>
-        </w:rPr>
-        <w:t>Impressionen</w:t>
-      </w:r>
-    </w:p>
-    <w:p>
-      <w:r>
-        <w:t xml:space="preserve">Die E28 5er-Reihe war nicht einfach ein Wettbewerber </w:t>
-      </w:r>
-      <w:r>
-        <w:t>–</w:t>
-      </w:r>
-      <w:r>
-        <w:t xml:space="preserve"> sie begründete eine ganz</w:t>
-      </w:r>
-      <w:r>
-        <w:t xml:space="preserve">e </w:t>
-      </w:r>
-      <w:r>
-        <w:t>Fahrzeugklasse. Als direkter Vorläufer der modernen Sportlimousine zeigte er, dass eine</w:t>
-      </w:r>
-      <w:r>
-        <w:t xml:space="preserve"> </w:t>
-      </w:r>
-      <w:r>
-        <w:t>viertürige</w:t>
-      </w:r>
-      <w:r>
-        <w:t xml:space="preserve"> </w:t>
-      </w:r>
-      <w:r>
-        <w:t>Obere-Mittelklasse-Limousine das Herz eines Sportwagens haben kann. Vom</w:t>
-      </w:r>
-      <w:r>
-        <w:t xml:space="preserve"> </w:t>
-      </w:r>
-      <w:r>
-        <w:t>fahrerorientierten Cockpit</w:t>
-      </w:r>
-      <w:r>
-        <w:t xml:space="preserve"> </w:t>
-      </w:r>
-      <w:r>
-        <w:t xml:space="preserve">bis </w:t>
+        <w:t xml:space="preserve"> sie begründete eine ganze Fahrzeugklasse. Als direkter Vorläufer der modernen Sportlimousine zeigte er, dass eine viertürige Obere-Mittelklasse-Limousine das Herz eines Sportwagens haben kann. Vom fahrerorientierten Cockpit bis </w:t>
       </w:r>
       <w:proofErr w:type="gramStart"/>
       <w:r>
@@ -431,33 +359,10 @@
           <w:sz w:val="24"/>
           <w:szCs w:val="24"/>
         </w:rPr>
-        <w:t>Freude am</w:t>
-      </w:r>
-      <w:r>
-        <w:rPr>
-          <w:i/>
-          <w:iCs/>
-          <w:color w:val="4C94D8" w:themeColor="text2" w:themeTint="80"/>
-          <w:sz w:val="24"/>
-          <w:szCs w:val="24"/>
-        </w:rPr>
-        <w:t xml:space="preserve"> </w:t>
-      </w:r>
-      <w:r>
-        <w:rPr>
-          <w:i/>
-          <w:iCs/>
-          <w:color w:val="4C94D8" w:themeColor="text2" w:themeTint="80"/>
-          <w:sz w:val="24"/>
-          <w:szCs w:val="24"/>
-        </w:rPr>
-        <w:t>Fahren</w:t>
-      </w:r>
-      <w:r>
-        <w:t xml:space="preserve"> </w:t>
-      </w:r>
-      <w:r>
-        <w:t>ausgelegt.</w:t>
+        <w:t>Freude am Fahren</w:t>
+      </w:r>
+      <w:r>
+        <w:t xml:space="preserve"> ausgelegt.</w:t>
       </w:r>
     </w:p>
     <w:p>
@@ -474,10 +379,10 @@
           <w:color w:val="000000" w:themeColor="text1"/>
         </w:rPr>
         <w:drawing>
-          <wp:inline distT="0" distB="0" distL="0" distR="0" wp14:anchorId="5C3844FE" wp14:editId="546EC253">
+          <wp:inline distT="0" distB="0" distL="0" distR="0" wp14:anchorId="5C3844FE" wp14:editId="590D8438">
             <wp:extent cx="4657725" cy="2000250"/>
             <wp:effectExtent l="0" t="0" r="9525" b="0"/>
-            <wp:docPr id="227256909" name="Grafik 1"/>
+            <wp:docPr id="227256909" name="Grafik 1" descr="Fotografie eines schwarzen, tiefergelegten BMW-Coupés vor einer grauen Industriewand, zur Präsentation eines stilisierten Fahrzeugumbaus. Auffällig sind Doppelscheinwerfer, verchromte Mehrspeichenräder, getönte Seitenscheiben und glänzende Karosserie. Ein klasse Schlitten!"/>
             <wp:cNvGraphicFramePr>
               <a:graphicFrameLocks xmlns:a="http://schemas.openxmlformats.org/drawingml/2006/main" noChangeAspect="1"/>
             </wp:cNvGraphicFramePr>
@@ -485,7 +390,7 @@
               <a:graphicData uri="http://schemas.openxmlformats.org/drawingml/2006/picture">
                 <pic:pic xmlns:pic="http://schemas.openxmlformats.org/drawingml/2006/picture">
                   <pic:nvPicPr>
-                    <pic:cNvPr id="227256909" name="Grafik 227256909"/>
+                    <pic:cNvPr id="227256909" name="Grafik 1" descr="Fotografie eines schwarzen, tiefergelegten BMW-Coupés vor einer grauen Industriewand, zur Präsentation eines stilisierten Fahrzeugumbaus. Auffällig sind Doppelscheinwerfer, verchromte Mehrspeichenräder, getönte Seitenscheiben und glänzende Karosserie. Ein klasse Schlitten!"/>
                     <pic:cNvPicPr/>
                   </pic:nvPicPr>
                   <pic:blipFill rotWithShape="1">
@@ -1493,6 +1398,7 @@
   <w:style w:type="character" w:default="1" w:styleId="Absatz-Standardschriftart">
     <w:name w:val="Default Paragraph Font"/>
     <w:uiPriority w:val="1"/>
+    <w:semiHidden/>
     <w:unhideWhenUsed/>
   </w:style>
   <w:style w:type="table" w:default="1" w:styleId="NormaleTabelle">

</xml_diff>